<commit_message>
Changed font of intro document
</commit_message>
<xml_diff>
--- a/Documentation/BigDeal history.docx
+++ b/Documentation/BigDeal history.docx
@@ -218,16 +218,8 @@
         <w:rPr>
           <w:lang w:val="en-US"/>
         </w:rPr>
-        <w:t xml:space="preserve"> Koen </w:t>
-      </w:r>
-      <w:proofErr w:type="spellStart"/>
-      <w:r>
-        <w:rPr>
-          <w:lang w:val="en-US"/>
-        </w:rPr>
-        <w:t>Gijsman</w:t>
-      </w:r>
-      <w:proofErr w:type="spellEnd"/>
+        <w:t xml:space="preserve"> Koen Gijsman</w:t>
+      </w:r>
       <w:r>
         <w:rPr>
           <w:lang w:val="en-US"/>
@@ -902,7 +894,14 @@
         <w:rPr>
           <w:lang w:val="en-US"/>
         </w:rPr>
-        <w:t xml:space="preserve"> thought to be operator error. But it set me thinking again, and being a research programmer in the Amoeba project I already knew that getting random numbers was less easy than it looks.</w:t>
+        <w:t xml:space="preserve"> thought to be operator error. But it set me thinking again, and being a research programmer in the Amoeba project I already knew that </w:t>
+      </w:r>
+      <w:r>
+        <w:rPr>
+          <w:lang w:val="en-US"/>
+        </w:rPr>
+        <w:lastRenderedPageBreak/>
+        <w:t>getting random numbers was less easy than it looks.</w:t>
       </w:r>
       <w:r>
         <w:rPr>

</xml_diff>